<commit_message>
Added the project file
</commit_message>
<xml_diff>
--- a/Projects/Extra Project/ServiceDeskAI/Project title.docx
+++ b/Projects/Extra Project/ServiceDeskAI/Project title.docx
@@ -39,7 +39,7 @@
     <w:p>
       <w:r>
         <w:pict w14:anchorId="5276A60C">
-          <v:rect id="_x0000_i1265" style="width:0;height:1.5pt" o:hralign="center" o:hrstd="t" o:hr="t" fillcolor="#a0a0a0" stroked="f"/>
+          <v:rect id="_x0000_i1025" style="width:0;height:1.5pt" o:hralign="center" o:hrstd="t" o:hr="t" fillcolor="#a0a0a0" stroked="f"/>
         </w:pict>
       </w:r>
     </w:p>
@@ -225,7 +225,7 @@
     <w:p>
       <w:r>
         <w:pict w14:anchorId="2CCD0309">
-          <v:rect id="_x0000_i1266" style="width:0;height:1.5pt" o:hralign="center" o:hrstd="t" o:hr="t" fillcolor="#a0a0a0" stroked="f"/>
+          <v:rect id="_x0000_i1026" style="width:0;height:1.5pt" o:hralign="center" o:hrstd="t" o:hr="t" fillcolor="#a0a0a0" stroked="f"/>
         </w:pict>
       </w:r>
     </w:p>
@@ -337,7 +337,7 @@
     <w:p>
       <w:r>
         <w:pict w14:anchorId="4FFA4098">
-          <v:rect id="_x0000_i1267" style="width:0;height:1.5pt" o:hralign="center" o:hrstd="t" o:hr="t" fillcolor="#a0a0a0" stroked="f"/>
+          <v:rect id="_x0000_i1027" style="width:0;height:1.5pt" o:hralign="center" o:hrstd="t" o:hr="t" fillcolor="#a0a0a0" stroked="f"/>
         </w:pict>
       </w:r>
     </w:p>
@@ -630,7 +630,7 @@
     <w:p>
       <w:r>
         <w:pict w14:anchorId="4E8CD644">
-          <v:rect id="_x0000_i1268" style="width:0;height:1.5pt" o:hralign="center" o:hrstd="t" o:hr="t" fillcolor="#a0a0a0" stroked="f"/>
+          <v:rect id="_x0000_i1028" style="width:0;height:1.5pt" o:hralign="center" o:hrstd="t" o:hr="t" fillcolor="#a0a0a0" stroked="f"/>
         </w:pict>
       </w:r>
     </w:p>
@@ -824,7 +824,7 @@
     <w:p>
       <w:r>
         <w:pict w14:anchorId="0C04E0BF">
-          <v:rect id="_x0000_i1269" style="width:0;height:1.5pt" o:hralign="center" o:hrstd="t" o:hr="t" fillcolor="#a0a0a0" stroked="f"/>
+          <v:rect id="_x0000_i1029" style="width:0;height:1.5pt" o:hralign="center" o:hrstd="t" o:hr="t" fillcolor="#a0a0a0" stroked="f"/>
         </w:pict>
       </w:r>
     </w:p>
@@ -948,7 +948,7 @@
     <w:p>
       <w:r>
         <w:pict w14:anchorId="322EC466">
-          <v:rect id="_x0000_i1270" style="width:0;height:1.5pt" o:hralign="center" o:hrstd="t" o:hr="t" fillcolor="#a0a0a0" stroked="f"/>
+          <v:rect id="_x0000_i1030" style="width:0;height:1.5pt" o:hralign="center" o:hrstd="t" o:hr="t" fillcolor="#a0a0a0" stroked="f"/>
         </w:pict>
       </w:r>
     </w:p>
@@ -1031,7 +1031,7 @@
     <w:p>
       <w:r>
         <w:pict w14:anchorId="47313BB2">
-          <v:rect id="_x0000_i1271" style="width:0;height:1.5pt" o:hralign="center" o:hrstd="t" o:hr="t" fillcolor="#a0a0a0" stroked="f"/>
+          <v:rect id="_x0000_i1031" style="width:0;height:1.5pt" o:hralign="center" o:hrstd="t" o:hr="t" fillcolor="#a0a0a0" stroked="f"/>
         </w:pict>
       </w:r>
     </w:p>
@@ -1099,7 +1099,7 @@
     <w:p>
       <w:r>
         <w:pict w14:anchorId="46CBEFCF">
-          <v:rect id="_x0000_i1272" style="width:0;height:1.5pt" o:hralign="center" o:hrstd="t" o:hr="t" fillcolor="#a0a0a0" stroked="f"/>
+          <v:rect id="_x0000_i1032" style="width:0;height:1.5pt" o:hralign="center" o:hrstd="t" o:hr="t" fillcolor="#a0a0a0" stroked="f"/>
         </w:pict>
       </w:r>
     </w:p>
@@ -1175,7 +1175,7 @@
     <w:p>
       <w:r>
         <w:pict w14:anchorId="18BBB15E">
-          <v:rect id="_x0000_i1273" style="width:0;height:1.5pt" o:hralign="center" o:hrstd="t" o:hr="t" fillcolor="#a0a0a0" stroked="f"/>
+          <v:rect id="_x0000_i1033" style="width:0;height:1.5pt" o:hralign="center" o:hrstd="t" o:hr="t" fillcolor="#a0a0a0" stroked="f"/>
         </w:pict>
       </w:r>
     </w:p>
@@ -1284,7 +1284,7 @@
     <w:p>
       <w:r>
         <w:pict w14:anchorId="73901C77">
-          <v:rect id="_x0000_i1274" style="width:0;height:1.5pt" o:hralign="center" o:hrstd="t" o:hr="t" fillcolor="#a0a0a0" stroked="f"/>
+          <v:rect id="_x0000_i1034" style="width:0;height:1.5pt" o:hralign="center" o:hrstd="t" o:hr="t" fillcolor="#a0a0a0" stroked="f"/>
         </w:pict>
       </w:r>
     </w:p>
@@ -1334,7 +1334,7 @@
     <w:p>
       <w:r>
         <w:pict w14:anchorId="7AA0FFB5">
-          <v:rect id="_x0000_i1275" style="width:0;height:1.5pt" o:hralign="center" o:hrstd="t" o:hr="t" fillcolor="#a0a0a0" stroked="f"/>
+          <v:rect id="_x0000_i1035" style="width:0;height:1.5pt" o:hralign="center" o:hrstd="t" o:hr="t" fillcolor="#a0a0a0" stroked="f"/>
         </w:pict>
       </w:r>
     </w:p>
@@ -1394,7 +1394,7 @@
     <w:p>
       <w:r>
         <w:pict w14:anchorId="0D7EB3F9">
-          <v:rect id="_x0000_i1276" style="width:0;height:1.5pt" o:hralign="center" o:hrstd="t" o:hr="t" fillcolor="#a0a0a0" stroked="f"/>
+          <v:rect id="_x0000_i1036" style="width:0;height:1.5pt" o:hralign="center" o:hrstd="t" o:hr="t" fillcolor="#a0a0a0" stroked="f"/>
         </w:pict>
       </w:r>
     </w:p>
@@ -1492,7 +1492,7 @@
     <w:p>
       <w:r>
         <w:pict w14:anchorId="50CB1C9D">
-          <v:rect id="_x0000_i1277" style="width:0;height:1.5pt" o:hralign="center" o:hrstd="t" o:hr="t" fillcolor="#a0a0a0" stroked="f"/>
+          <v:rect id="_x0000_i1037" style="width:0;height:1.5pt" o:hralign="center" o:hrstd="t" o:hr="t" fillcolor="#a0a0a0" stroked="f"/>
         </w:pict>
       </w:r>
     </w:p>
@@ -1563,7 +1563,7 @@
     <w:p>
       <w:r>
         <w:pict w14:anchorId="1B15A5FA">
-          <v:rect id="_x0000_i1278" style="width:0;height:1.5pt" o:hralign="center" o:hrstd="t" o:hr="t" fillcolor="#a0a0a0" stroked="f"/>
+          <v:rect id="_x0000_i1038" style="width:0;height:1.5pt" o:hralign="center" o:hrstd="t" o:hr="t" fillcolor="#a0a0a0" stroked="f"/>
         </w:pict>
       </w:r>
     </w:p>
@@ -1583,13 +1583,8 @@
       </w:r>
     </w:p>
     <w:p>
-      <w:proofErr w:type="gramStart"/>
-      <w:r>
-        <w:t>I’m</w:t>
-      </w:r>
-      <w:proofErr w:type="gramEnd"/>
-      <w:r>
-        <w:t xml:space="preserve"> assuming the class machines are on </w:t>
+      <w:r>
+        <w:t xml:space="preserve">I’m assuming the class machines are on </w:t>
       </w:r>
       <w:r>
         <w:rPr>
@@ -1823,7 +1818,7 @@
     <w:p>
       <w:r>
         <w:pict w14:anchorId="288D33B9">
-          <v:rect id="_x0000_i1279" style="width:0;height:1.5pt" o:hralign="center" o:hrstd="t" o:hr="t" fillcolor="#a0a0a0" stroked="f"/>
+          <v:rect id="_x0000_i1039" style="width:0;height:1.5pt" o:hralign="center" o:hrstd="t" o:hr="t" fillcolor="#a0a0a0" stroked="f"/>
         </w:pict>
       </w:r>
     </w:p>
@@ -1874,15 +1869,7 @@
     </w:p>
     <w:p>
       <w:r>
-        <w:t xml:space="preserve">Open the official Python downloads page. The current Python downloads page lists Python 3.14.3 as the latest general download </w:t>
-      </w:r>
-      <w:proofErr w:type="gramStart"/>
-      <w:r>
-        <w:t>at the moment</w:t>
-      </w:r>
-      <w:proofErr w:type="gramEnd"/>
-      <w:r>
-        <w:t xml:space="preserve">. </w:t>
+        <w:t xml:space="preserve">Open the official Python downloads page. The current Python downloads page lists Python 3.14.3 as the latest general download at the moment. </w:t>
       </w:r>
     </w:p>
     <w:p>
@@ -2026,7 +2013,7 @@
     <w:p>
       <w:r>
         <w:pict w14:anchorId="4C061A1F">
-          <v:rect id="_x0000_i1280" style="width:0;height:1.5pt" o:hralign="center" o:hrstd="t" o:hr="t" fillcolor="#a0a0a0" stroked="f"/>
+          <v:rect id="_x0000_i1040" style="width:0;height:1.5pt" o:hralign="center" o:hrstd="t" o:hr="t" fillcolor="#a0a0a0" stroked="f"/>
         </w:pict>
       </w:r>
     </w:p>
@@ -2198,7 +2185,7 @@
     <w:p>
       <w:r>
         <w:pict w14:anchorId="2124EFE7">
-          <v:rect id="_x0000_i1281" style="width:0;height:1.5pt" o:hralign="center" o:hrstd="t" o:hr="t" fillcolor="#a0a0a0" stroked="f"/>
+          <v:rect id="_x0000_i1041" style="width:0;height:1.5pt" o:hralign="center" o:hrstd="t" o:hr="t" fillcolor="#a0a0a0" stroked="f"/>
         </w:pict>
       </w:r>
     </w:p>
@@ -2305,7 +2292,7 @@
     <w:p>
       <w:r>
         <w:pict w14:anchorId="21144630">
-          <v:rect id="_x0000_i1282" style="width:0;height:1.5pt" o:hralign="center" o:hrstd="t" o:hr="t" fillcolor="#a0a0a0" stroked="f"/>
+          <v:rect id="_x0000_i1042" style="width:0;height:1.5pt" o:hralign="center" o:hrstd="t" o:hr="t" fillcolor="#a0a0a0" stroked="f"/>
         </w:pict>
       </w:r>
     </w:p>
@@ -2367,7 +2354,7 @@
     <w:p>
       <w:r>
         <w:pict w14:anchorId="21D56E0A">
-          <v:rect id="_x0000_i1283" style="width:0;height:1.5pt" o:hralign="center" o:hrstd="t" o:hr="t" fillcolor="#a0a0a0" stroked="f"/>
+          <v:rect id="_x0000_i1043" style="width:0;height:1.5pt" o:hralign="center" o:hrstd="t" o:hr="t" fillcolor="#a0a0a0" stroked="f"/>
         </w:pict>
       </w:r>
     </w:p>
@@ -2460,7 +2447,7 @@
     <w:p>
       <w:r>
         <w:pict w14:anchorId="13EB3DDE">
-          <v:rect id="_x0000_i1284" style="width:0;height:1.5pt" o:hralign="center" o:hrstd="t" o:hr="t" fillcolor="#a0a0a0" stroked="f"/>
+          <v:rect id="_x0000_i1044" style="width:0;height:1.5pt" o:hralign="center" o:hrstd="t" o:hr="t" fillcolor="#a0a0a0" stroked="f"/>
         </w:pict>
       </w:r>
     </w:p>
@@ -2533,7 +2520,7 @@
     <w:p>
       <w:r>
         <w:pict w14:anchorId="42B12505">
-          <v:rect id="_x0000_i1285" style="width:0;height:1.5pt" o:hralign="center" o:hrstd="t" o:hr="t" fillcolor="#a0a0a0" stroked="f"/>
+          <v:rect id="_x0000_i1045" style="width:0;height:1.5pt" o:hralign="center" o:hrstd="t" o:hr="t" fillcolor="#a0a0a0" stroked="f"/>
         </w:pict>
       </w:r>
     </w:p>
@@ -2630,7 +2617,7 @@
     <w:p>
       <w:r>
         <w:pict w14:anchorId="20E61393">
-          <v:rect id="_x0000_i1286" style="width:0;height:1.5pt" o:hralign="center" o:hrstd="t" o:hr="t" fillcolor="#a0a0a0" stroked="f"/>
+          <v:rect id="_x0000_i1046" style="width:0;height:1.5pt" o:hralign="center" o:hrstd="t" o:hr="t" fillcolor="#a0a0a0" stroked="f"/>
         </w:pict>
       </w:r>
     </w:p>
@@ -3143,7 +3130,7 @@
     <w:p>
       <w:r>
         <w:pict w14:anchorId="3589B150">
-          <v:rect id="_x0000_i1287" style="width:0;height:1.5pt" o:hralign="center" o:hrstd="t" o:hr="t" fillcolor="#a0a0a0" stroked="f"/>
+          <v:rect id="_x0000_i1047" style="width:0;height:1.5pt" o:hralign="center" o:hrstd="t" o:hr="t" fillcolor="#a0a0a0" stroked="f"/>
         </w:pict>
       </w:r>
     </w:p>
@@ -3852,7 +3839,13 @@
         <w:t>──</w:t>
       </w:r>
       <w:r>
-        <w:t xml:space="preserve"> views.py</w:t>
+        <w:t xml:space="preserve"> </w:t>
+      </w:r>
+      <w:r>
+        <w:rPr>
+          <w:color w:val="EE0000"/>
+        </w:rPr>
+        <w:t>views.py</w:t>
       </w:r>
       <w:r>
         <w:br/>
@@ -4061,7 +4054,7 @@
     <w:p>
       <w:r>
         <w:pict w14:anchorId="7E642BC4">
-          <v:rect id="_x0000_i1288" style="width:0;height:1.5pt" o:hralign="center" o:hrstd="t" o:hr="t" fillcolor="#a0a0a0" stroked="f"/>
+          <v:rect id="_x0000_i1048" style="width:0;height:1.5pt" o:hralign="center" o:hrstd="t" o:hr="t" fillcolor="#a0a0a0" stroked="f"/>
         </w:pict>
       </w:r>
     </w:p>
@@ -4227,7 +4220,7 @@
     <w:p>
       <w:r>
         <w:pict w14:anchorId="63EFF902">
-          <v:rect id="_x0000_i1289" style="width:0;height:1.5pt" o:hralign="center" o:hrstd="t" o:hr="t" fillcolor="#a0a0a0" stroked="f"/>
+          <v:rect id="_x0000_i1049" style="width:0;height:1.5pt" o:hralign="center" o:hrstd="t" o:hr="t" fillcolor="#a0a0a0" stroked="f"/>
         </w:pict>
       </w:r>
     </w:p>
@@ -4255,7 +4248,7 @@
     <w:p>
       <w:r>
         <w:pict w14:anchorId="0830B6D8">
-          <v:rect id="_x0000_i1290" style="width:0;height:1.5pt" o:hralign="center" o:hrstd="t" o:hr="t" fillcolor="#a0a0a0" stroked="f"/>
+          <v:rect id="_x0000_i1050" style="width:0;height:1.5pt" o:hralign="center" o:hrstd="t" o:hr="t" fillcolor="#a0a0a0" stroked="f"/>
         </w:pict>
       </w:r>
     </w:p>
@@ -4326,7 +4319,7 @@
     <w:p>
       <w:r>
         <w:pict w14:anchorId="4FE32C46">
-          <v:rect id="_x0000_i1291" style="width:0;height:1.5pt" o:hralign="center" o:hrstd="t" o:hr="t" fillcolor="#a0a0a0" stroked="f"/>
+          <v:rect id="_x0000_i1051" style="width:0;height:1.5pt" o:hralign="center" o:hrstd="t" o:hr="t" fillcolor="#a0a0a0" stroked="f"/>
         </w:pict>
       </w:r>
     </w:p>
@@ -4353,7 +4346,7 @@
     <w:p>
       <w:r>
         <w:pict w14:anchorId="59264EEC">
-          <v:rect id="_x0000_i1292" style="width:0;height:1.5pt" o:hralign="center" o:hrstd="t" o:hr="t" fillcolor="#a0a0a0" stroked="f"/>
+          <v:rect id="_x0000_i1052" style="width:0;height:1.5pt" o:hralign="center" o:hrstd="t" o:hr="t" fillcolor="#a0a0a0" stroked="f"/>
         </w:pict>
       </w:r>
     </w:p>
@@ -4445,7 +4438,7 @@
     <w:p>
       <w:r>
         <w:pict w14:anchorId="2DAE973E">
-          <v:rect id="_x0000_i1293" style="width:0;height:1.5pt" o:hralign="center" o:hrstd="t" o:hr="t" fillcolor="#a0a0a0" stroked="f"/>
+          <v:rect id="_x0000_i1053" style="width:0;height:1.5pt" o:hralign="center" o:hrstd="t" o:hr="t" fillcolor="#a0a0a0" stroked="f"/>
         </w:pict>
       </w:r>
     </w:p>
@@ -4472,7 +4465,7 @@
     <w:p>
       <w:r>
         <w:pict w14:anchorId="1DECE165">
-          <v:rect id="_x0000_i1294" style="width:0;height:1.5pt" o:hralign="center" o:hrstd="t" o:hr="t" fillcolor="#a0a0a0" stroked="f"/>
+          <v:rect id="_x0000_i1054" style="width:0;height:1.5pt" o:hralign="center" o:hrstd="t" o:hr="t" fillcolor="#a0a0a0" stroked="f"/>
         </w:pict>
       </w:r>
     </w:p>
@@ -4499,7 +4492,7 @@
     <w:p>
       <w:r>
         <w:pict w14:anchorId="238F9830">
-          <v:rect id="_x0000_i1295" style="width:0;height:1.5pt" o:hralign="center" o:hrstd="t" o:hr="t" fillcolor="#a0a0a0" stroked="f"/>
+          <v:rect id="_x0000_i1055" style="width:0;height:1.5pt" o:hralign="center" o:hrstd="t" o:hr="t" fillcolor="#a0a0a0" stroked="f"/>
         </w:pict>
       </w:r>
     </w:p>
@@ -4527,7 +4520,7 @@
       <w:r>
         <w:lastRenderedPageBreak/>
         <w:pict w14:anchorId="56CE41A1">
-          <v:rect id="_x0000_i1296" style="width:0;height:1.5pt" o:hralign="center" o:hrstd="t" o:hr="t" fillcolor="#a0a0a0" stroked="f"/>
+          <v:rect id="_x0000_i1056" style="width:0;height:1.5pt" o:hralign="center" o:hrstd="t" o:hr="t" fillcolor="#a0a0a0" stroked="f"/>
         </w:pict>
       </w:r>
     </w:p>
@@ -4554,7 +4547,7 @@
     <w:p>
       <w:r>
         <w:pict w14:anchorId="41B88F4F">
-          <v:rect id="_x0000_i1297" style="width:0;height:1.5pt" o:hralign="center" o:hrstd="t" o:hr="t" fillcolor="#a0a0a0" stroked="f"/>
+          <v:rect id="_x0000_i1057" style="width:0;height:1.5pt" o:hralign="center" o:hrstd="t" o:hr="t" fillcolor="#a0a0a0" stroked="f"/>
         </w:pict>
       </w:r>
     </w:p>
@@ -4581,7 +4574,7 @@
     <w:p>
       <w:r>
         <w:pict w14:anchorId="605EB106">
-          <v:rect id="_x0000_i1298" style="width:0;height:1.5pt" o:hralign="center" o:hrstd="t" o:hr="t" fillcolor="#a0a0a0" stroked="f"/>
+          <v:rect id="_x0000_i1058" style="width:0;height:1.5pt" o:hralign="center" o:hrstd="t" o:hr="t" fillcolor="#a0a0a0" stroked="f"/>
         </w:pict>
       </w:r>
     </w:p>
@@ -4608,7 +4601,7 @@
     <w:p>
       <w:r>
         <w:pict w14:anchorId="2BBA1F87">
-          <v:rect id="_x0000_i1299" style="width:0;height:1.5pt" o:hralign="center" o:hrstd="t" o:hr="t" fillcolor="#a0a0a0" stroked="f"/>
+          <v:rect id="_x0000_i1059" style="width:0;height:1.5pt" o:hralign="center" o:hrstd="t" o:hr="t" fillcolor="#a0a0a0" stroked="f"/>
         </w:pict>
       </w:r>
     </w:p>
@@ -4720,7 +4713,7 @@
     <w:p>
       <w:r>
         <w:pict w14:anchorId="1E584A8C">
-          <v:rect id="_x0000_i1300" style="width:0;height:1.5pt" o:hralign="center" o:hrstd="t" o:hr="t" fillcolor="#a0a0a0" stroked="f"/>
+          <v:rect id="_x0000_i1060" style="width:0;height:1.5pt" o:hralign="center" o:hrstd="t" o:hr="t" fillcolor="#a0a0a0" stroked="f"/>
         </w:pict>
       </w:r>
     </w:p>
@@ -4736,23 +4729,7 @@
           <w:b/>
           <w:bCs/>
         </w:rPr>
-        <w:t xml:space="preserve">16. What AI will </w:t>
-      </w:r>
-      <w:proofErr w:type="gramStart"/>
-      <w:r>
-        <w:rPr>
-          <w:b/>
-          <w:bCs/>
-        </w:rPr>
-        <w:t>actually do</w:t>
-      </w:r>
-      <w:proofErr w:type="gramEnd"/>
-      <w:r>
-        <w:rPr>
-          <w:b/>
-          <w:bCs/>
-        </w:rPr>
-        <w:t xml:space="preserve"> here</w:t>
+        <w:t>16. What AI will actually do here</w:t>
       </w:r>
     </w:p>
     <w:p>
@@ -4844,7 +4821,7 @@
     <w:p>
       <w:r>
         <w:pict w14:anchorId="3C30A1CB">
-          <v:rect id="_x0000_i1301" style="width:0;height:1.5pt" o:hralign="center" o:hrstd="t" o:hr="t" fillcolor="#a0a0a0" stroked="f"/>
+          <v:rect id="_x0000_i1061" style="width:0;height:1.5pt" o:hralign="center" o:hrstd="t" o:hr="t" fillcolor="#a0a0a0" stroked="f"/>
         </w:pict>
       </w:r>
     </w:p>
@@ -5307,7 +5284,7 @@
     <w:p>
       <w:r>
         <w:pict w14:anchorId="30BBC6C8">
-          <v:rect id="_x0000_i1302" style="width:0;height:1.5pt" o:hralign="center" o:hrstd="t" o:hr="t" fillcolor="#a0a0a0" stroked="f"/>
+          <v:rect id="_x0000_i1062" style="width:0;height:1.5pt" o:hralign="center" o:hrstd="t" o:hr="t" fillcolor="#a0a0a0" stroked="f"/>
         </w:pict>
       </w:r>
     </w:p>
@@ -5352,7 +5329,7 @@
     <w:p>
       <w:r>
         <w:pict w14:anchorId="2EC5BEEC">
-          <v:rect id="_x0000_i1303" style="width:0;height:1.5pt" o:hralign="center" o:hrstd="t" o:hr="t" fillcolor="#a0a0a0" stroked="f"/>
+          <v:rect id="_x0000_i1063" style="width:0;height:1.5pt" o:hralign="center" o:hrstd="t" o:hr="t" fillcolor="#a0a0a0" stroked="f"/>
         </w:pict>
       </w:r>
     </w:p>
@@ -5454,7 +5431,7 @@
     <w:p>
       <w:r>
         <w:pict w14:anchorId="733A3C86">
-          <v:rect id="_x0000_i1304" style="width:0;height:1.5pt" o:hralign="center" o:hrstd="t" o:hr="t" fillcolor="#a0a0a0" stroked="f"/>
+          <v:rect id="_x0000_i1064" style="width:0;height:1.5pt" o:hralign="center" o:hrstd="t" o:hr="t" fillcolor="#a0a0a0" stroked="f"/>
         </w:pict>
       </w:r>
     </w:p>
@@ -5520,15 +5497,7 @@
     </w:p>
     <w:p>
       <w:r>
-        <w:t xml:space="preserve">In the next message, </w:t>
-      </w:r>
-      <w:proofErr w:type="gramStart"/>
-      <w:r>
-        <w:t>I’ll</w:t>
-      </w:r>
-      <w:proofErr w:type="gramEnd"/>
-      <w:r>
-        <w:t xml:space="preserve"> start with the </w:t>
+        <w:t xml:space="preserve">In the next message, I’ll start with the </w:t>
       </w:r>
       <w:r>
         <w:rPr>
@@ -12048,6 +12017,7 @@
   <w:style w:type="character" w:default="1" w:styleId="DefaultParagraphFont">
     <w:name w:val="Default Paragraph Font"/>
     <w:uiPriority w:val="1"/>
+    <w:semiHidden/>
     <w:unhideWhenUsed/>
   </w:style>
   <w:style w:type="table" w:default="1" w:styleId="TableNormal">

</xml_diff>